<commit_message>
feat: Enhance WebRTC video call functionality with dynamic ICE server configuration
</commit_message>
<xml_diff>
--- a/Bao_cao_Cong_nghe_Web_va_Dich_vu_truc_tuyen_7Study_LMS.docx
+++ b/Bao_cao_Cong_nghe_Web_va_Dich_vu_truc_tuyen_7Study_LMS.docx
@@ -4651,7 +4651,7 @@
         <w:ind w:firstLine="360"/>
       </w:pPr>
       <w:r>
-        <w:t>Ngoài các chức năng cốt lõi, dự án đã hoàn thiện thêm các tính năng nâng cao: chat thảo luận thời gian thực (WebSocket/socket.io), hệ thống thông báo in-app (realtime), import câu hỏi quiz từ file CSV, upload avatar người dùng và lớp học, reset mật khẩu qua email, và triển khai online trên Render + Neon.</w:t>
+        <w:t>Ngoài các chức năng cốt lõi, dự án đã hoàn thiện thêm các tính năng nâng cao: chat thảo luận thời gian thực (WebSocket/socket.io), hệ thống thông báo in-app realtime (gồm cả thông báo khi nộp bài và khi bài được chấm điểm), xem danh sách thành viên lớp học (giáo viên và sinh viên), thoát lớp học, import sinh viên hàng loạt từ file CSV theo mã sinh viên, và cuộc gọi video WebRTC P2P hỗ trợ thu nhỏ màn hình (PiP), chia sẻ màn hình và xem danh sách thành viên trong cuộc gọi.</w:t>
       </w:r>
     </w:p>
     <w:p>
@@ -4771,7 +4771,7 @@
           <w:tcPr/>
           <w:p>
             <w:r>
-              <w:t xml:space="preserve">Đăng ký / Đăng nhập / Đổi mật khẩu | Tạo/sửa/xóa lớp học | Upload ảnh đại diện lớp | Duyệt/từ chối sinh viên vào lớp | Thêm/sửa/xóa section và lesson (4 loại nội dung) | Upload tài nguyên lớp (PDF/ZIP), quản lý theo thư mục | Tạo/sửa quiz + import câu hỏi từ CSV | Tạo bài tập có deadline, chấm điểm và phản hồi | Tạo thảo luận, chat realtime | Xem tiến độ học của từng sinh viên | Nhận thông báo in-app</w:t>
+              <w:t>Đăng ký / Đăng nhập / Đổi mật khẩu | Tạo/sửa/xóa lớp học | Upload ảnh đại diện lớp | Duyệt/từ chối sinh viên vào lớp | Thêm/sửa/xóa section và lesson (4 loại nội dung) | Upload tài nguyên lớp (PDF/ZIP), quản lý theo thư mục | Tạo/sửa quiz + import câu hỏi từ CSV | Tạo bài tập có deadline, chấm điểm và phản hồi | Tạo thảo luận, chat realtime | Xem tiến độ học của từng sinh viên | Nhận thông báo in-app | Xem danh sách thành viên lớp | Gọi video WebRTC</w:t>
             </w:r>
           </w:p>
         </w:tc>
@@ -4779,7 +4779,7 @@
           <w:tcPr/>
           <w:p>
             <w:r>
-              <w:t xml:space="preserve">11 use case</w:t>
+              <w:t>13 use case</w:t>
             </w:r>
           </w:p>
         </w:tc>
@@ -4797,7 +4797,7 @@
           <w:tcPr/>
           <w:p>
             <w:r>
-              <w:t xml:space="preserve">Đăng ký / Đăng nhập / Đổi mật khẩu / Reset qua email | Xem danh sách lớp đã tham gia | Gửi yêu cầu tham gia lớp (join code) | Xem và học bài (text/video/file/quiz) | Đánh dấu bài học đã hoàn thành | Làm quiz, xem điểm và lịch sử làm bài | Nộp bài tập (upload file), xem phản hồi giáo viên | Chat thảo luận realtime | Xem tiến độ học tập cá nhân | Nhận thông báo in-app</w:t>
+              <w:t>Đăng ký / Đăng nhập / Đổi mật khẩu / Reset qua email | Xem danh sách lớp đã tham gia | Gửi yêu cầu tham gia lớp (join code) | Xem và học bài (text/video/file/quiz) | Đánh dấu bài học đã hoàn thành | Làm quiz, xem điểm và lịch sử làm bài | Nộp bài tập (upload file), xem phản hồi giáo viên | Chat thảo luận realtime | Xem tiến độ học tập cá nhân | Nhận thông báo in-app | Thoát lớp học | Xem danh sách thành viên lớp | Tham gia gọi video WebRTC</w:t>
             </w:r>
           </w:p>
         </w:tc>
@@ -4805,7 +4805,7 @@
           <w:tcPr/>
           <w:p>
             <w:r>
-              <w:t xml:space="preserve">10 use case</w:t>
+              <w:t>13 use case</w:t>
             </w:r>
           </w:p>
         </w:tc>
@@ -5612,6 +5612,132 @@
           <w:p>
             <w:r>
               <w:t xml:space="preserve">&lt;&lt;include&gt;&gt; UC-02</w:t>
+            </w:r>
+          </w:p>
+        </w:tc>
+      </w:tr>
+      <w:tr>
+        <w:tc>
+          <w:tcPr>
+            <w:tcW w:type="dxa" w:w="720"/>
+          </w:tcPr>
+          <w:p>
+            <w:r>
+              <w:t>UC-21</w:t>
+            </w:r>
+          </w:p>
+        </w:tc>
+        <w:tc>
+          <w:tcPr>
+            <w:tcW w:type="dxa" w:w="3000"/>
+          </w:tcPr>
+          <w:p>
+            <w:r>
+              <w:t>Xem danh sách thành viên lớp học</w:t>
+            </w:r>
+          </w:p>
+        </w:tc>
+        <w:tc>
+          <w:tcPr>
+            <w:tcW w:type="dxa" w:w="1800"/>
+          </w:tcPr>
+          <w:p>
+            <w:r>
+              <w:t>GV, SV</w:t>
+            </w:r>
+          </w:p>
+        </w:tc>
+        <w:tc>
+          <w:tcPr>
+            <w:tcW w:type="dxa" w:w="3552"/>
+          </w:tcPr>
+          <w:p>
+            <w:r>
+              <w:t>&lt;&lt;include&gt;&gt; UC-02</w:t>
+            </w:r>
+          </w:p>
+        </w:tc>
+      </w:tr>
+      <w:tr>
+        <w:tc>
+          <w:tcPr>
+            <w:tcW w:type="dxa" w:w="720"/>
+          </w:tcPr>
+          <w:p>
+            <w:r>
+              <w:t>UC-22</w:t>
+            </w:r>
+          </w:p>
+        </w:tc>
+        <w:tc>
+          <w:tcPr>
+            <w:tcW w:type="dxa" w:w="3000"/>
+          </w:tcPr>
+          <w:p>
+            <w:r>
+              <w:t>Thoát lớp học</w:t>
+            </w:r>
+          </w:p>
+        </w:tc>
+        <w:tc>
+          <w:tcPr>
+            <w:tcW w:type="dxa" w:w="1800"/>
+          </w:tcPr>
+          <w:p>
+            <w:r>
+              <w:t>SV</w:t>
+            </w:r>
+          </w:p>
+        </w:tc>
+        <w:tc>
+          <w:tcPr>
+            <w:tcW w:type="dxa" w:w="3552"/>
+          </w:tcPr>
+          <w:p>
+            <w:r>
+              <w:t>&lt;&lt;include&gt;&gt; UC-02</w:t>
+            </w:r>
+          </w:p>
+        </w:tc>
+      </w:tr>
+      <w:tr>
+        <w:tc>
+          <w:tcPr>
+            <w:tcW w:type="dxa" w:w="720"/>
+          </w:tcPr>
+          <w:p>
+            <w:r>
+              <w:t>UC-23</w:t>
+            </w:r>
+          </w:p>
+        </w:tc>
+        <w:tc>
+          <w:tcPr>
+            <w:tcW w:type="dxa" w:w="3000"/>
+          </w:tcPr>
+          <w:p>
+            <w:r>
+              <w:t>Gọi video WebRTC (P2P, minimize, screen share, participants)</w:t>
+            </w:r>
+          </w:p>
+        </w:tc>
+        <w:tc>
+          <w:tcPr>
+            <w:tcW w:type="dxa" w:w="1800"/>
+          </w:tcPr>
+          <w:p>
+            <w:r>
+              <w:t>GV, SV</w:t>
+            </w:r>
+          </w:p>
+        </w:tc>
+        <w:tc>
+          <w:tcPr>
+            <w:tcW w:type="dxa" w:w="3552"/>
+          </w:tcPr>
+          <w:p>
+            <w:r>
+              <w:t>&lt;&lt;include&gt;&gt; UC-02</w:t>
             </w:r>
           </w:p>
         </w:tc>
@@ -8815,6 +8941,28 @@
           </w:p>
         </w:tc>
       </w:tr>
+      <w:tr>
+        <w:tc>
+          <w:tcPr>
+            <w:tcW w:type="dxa" w:w="3101"/>
+          </w:tcPr>
+          <w:p>
+            <w:r>
+              <w:t>Video Call</w:t>
+            </w:r>
+          </w:p>
+        </w:tc>
+        <w:tc>
+          <w:tcPr>
+            <w:tcW w:type="dxa" w:w="6144"/>
+          </w:tcPr>
+          <w:p>
+            <w:r>
+              <w:t>WebRTC (RTCPeerConnection, getDisplayMedia) + STUN Google</w:t>
+            </w:r>
+          </w:p>
+        </w:tc>
+      </w:tr>
     </w:tbl>
     <w:p>
       <w:pPr>
@@ -11767,7 +11915,7 @@
         <w:ind w:firstLine="360"/>
       </w:pPr>
       <w:r>
-        <w:t>Nhóm API này xử lý tạo/sửa/xóa/xem lớp, lấy lớp của giáo viên hoặc sinh viên, sinh viên gửi yêu cầu tham gia và giáo viên duyệt yêu cầu tham gia.</w:t>
+        <w:t>Nhóm API này xử lý tạo/sửa/xóa/xem lớp, lấy lớp của giáo viên hoặc sinh viên, sinh viên gửi yêu cầu tham gia và giáo viên duyệt/từ chối. Bổ sung: GET /class-members/classes/:id/members – xem danh sách thành viên hoạt động (teacher từ classes.teacher_id, student từ class_members); DELETE /class-members/classes/:id/leave – sinh viên thoát lớp, có thông báo realtime tới giáo viên.</w:t>
       </w:r>
     </w:p>
     <w:tbl>
@@ -12428,6 +12576,29 @@
     <w:p>
       <w:r>
         <w:br w:type="page"/>
+      </w:r>
+    </w:p>
+    <w:p>
+      <w:pPr>
+        <w:pStyle w:val="Heading2"/>
+      </w:pPr>
+      <w:r>
+        <w:t>7.8. Video Call (WebRTC)</w:t>
+      </w:r>
+    </w:p>
+    <w:p>
+      <w:r>
+        <w:t>Module Video Call triển khai cuộc gọi video theo kiến trúc Mesh P2P: mỗi người tham gia kết nối trực tiếp với tất cả người còn lại qua RTCPeerConnection, phù hợp lớp học quy mô nhỏ (dưới 8 người đồng thời).</w:t>
+      </w:r>
+    </w:p>
+    <w:p>
+      <w:r>
+        <w:t>Signaling Server: NestJS WebSocket Gateway namespace /video-call xử lý 5 sự kiện: join-call (kết nạp thành viên, trả về danh sách người có sẵn), leave-call, offer (SDP offer từ người mới), answer (SDP answer từ người nhận) và ice-candidate (relay ICE). ICE traversal dùng Google STUN (stun.l.google.com:19302).</w:t>
+      </w:r>
+    </w:p>
+    <w:p>
+      <w:r>
+        <w:t>Frontend (VideoCallModal.jsx) hỗ trợ ba tính năng bổ sung: (1) Thu nhỏ màn hình – chuyển sang floating card góc dưới-phải (PiP), âm thanh remote vẫn phát qua hidden &lt;video&gt; sink; (2) Chia sẻ màn hình – dùng getDisplayMedia() rồi replaceTrack() trên tất cả RTCRtpSender.video, không cần renegotiate; (3) Danh sách thành viên – sidebar hiển thị tất cả người trong cuộc gọi.</w:t>
       </w:r>
     </w:p>
     <w:p>
@@ -12984,7 +13155,7 @@
         <w:ind w:firstLine="360"/>
       </w:pPr>
       <w:r>
-        <w:t>Trang chi tiết lớp học gồm các tab: Bài học, BTVN, Tài nguyên, Tiến độ và Thảo luận. Trong tab Bài học, lesson có thể là text, video, file hoặc quiz. Text lesson được hiển thị inline; video mở URL YouTube; file mở link Supabase/PDF/ZIP; quiz điều hướng sang trang làm quiz.</w:t>
+        <w:t>Trang chi tiết lớp học gồm 6 tab: Bài học, BTVN, Tài nguyên, Tiến độ, Thảo luận và Thành viên. Tab Thành viên hiển thị danh sách giáo viên (từ classes.teacher_id) và sinh viên hoạt động (từ class_members), sinh viên có thể thoát lớp trực tiếp từ tab này. Trong tab Thảo luận có nút Gọi video mở VideoCallModal (WebRTC P2P) hỗ trợ thu nhỏ màn hình (PiP), chia sẻ màn hình và xem danh sách người trong cuộc gọi. Trong tab Bài học, lesson có thể là text, video YouTube, file hoặc quiz; giáo viên có thể tạo section/lesson trực tiếp từ UI.</w:t>
       </w:r>
     </w:p>
     <w:p>
@@ -14078,6 +14249,31 @@
       </w:r>
     </w:p>
     <w:p>
+      <w:r>
+        <w:t>✅ Xem danh sách thành viên lớp học (giáo viên + sinh viên đang hoạt động)</w:t>
+      </w:r>
+    </w:p>
+    <w:p>
+      <w:r>
+        <w:t>✅ Sinh viên thoát lớp học, giáo viên nhận thông báo realtime</w:t>
+      </w:r>
+    </w:p>
+    <w:p>
+      <w:r>
+        <w:t>✅ Import sinh viên hàng loạt từ danh sách mã sinh viên (CSV)</w:t>
+      </w:r>
+    </w:p>
+    <w:p>
+      <w:r>
+        <w:t>✅ Thông báo realtime khi sinh viên nộp bài và khi bài được chấm điểm</w:t>
+      </w:r>
+    </w:p>
+    <w:p>
+      <w:r>
+        <w:t>✅ Gọi video WebRTC P2P: thu nhỏ màn hình (PiP), chia sẻ màn hình (getDisplayMedia + replaceTrack), xem danh sách thành viên trong cuộc gọi</w:t>
+      </w:r>
+    </w:p>
+    <w:p>
       <w:pPr>
         <w:pStyle w:val="Heading1"/>
         <w:spacing w:before="240" w:after="160"/>
@@ -14108,7 +14304,7 @@
         <w:ind w:left="432" w:hanging="216"/>
       </w:pPr>
       <w:r>
-        <w:t>Chưa có import/export danh sách sinh viên hàng loạt (CSV).</w:t>
+        <w:t>Chưa có export danh sách điểm và tiến độ sinh viên ra file CSV/Excel.</w:t>
       </w:r>
     </w:p>
     <w:p>
@@ -14158,6 +14354,11 @@
         <w:ind w:left="432" w:hanging="216"/>
       </w:pPr>
       <w:r/>
+    </w:p>
+    <w:p>
+      <w:r>
+        <w:t>Video call WebRTC chỉ phù hợp quy mô nhỏ (dưới 8 người đồng thời) do kiến trúc Mesh P2P; chưa tích hợp SFU server (mediasoup/Janus) cho lớp học đông. Chưa hỗ trợ ghi lại cuộc họp.</w:t>
+      </w:r>
     </w:p>
     <w:p>
       <w:pPr>
@@ -14180,7 +14381,7 @@
         <w:ind w:left="432" w:hanging="216"/>
       </w:pPr>
       <w:r>
-        <w:t>Thêm realtime notification bằng WebSocket.</w:t>
+        <w:t>Thêm analytics cho tiến độ và điểm số sinh viên.</w:t>
       </w:r>
     </w:p>
     <w:p>
@@ -14190,7 +14391,7 @@
         <w:ind w:left="432" w:hanging="216"/>
       </w:pPr>
       <w:r>
-        <w:t>Thêm analytics cho tiến độ và điểm số sinh viên.</w:t>
+        <w:t>Thêm lịch học và nhắc deadline.</w:t>
       </w:r>
     </w:p>
     <w:p>
@@ -14200,7 +14401,7 @@
         <w:ind w:left="432" w:hanging="216"/>
       </w:pPr>
       <w:r>
-        <w:t>Thêm lịch học và nhắc deadline.</w:t>
+        <w:t>Thêm rubric chấm điểm assignment.</w:t>
       </w:r>
     </w:p>
     <w:p>
@@ -14210,7 +14411,7 @@
         <w:ind w:left="432" w:hanging="216"/>
       </w:pPr>
       <w:r>
-        <w:t>Thêm rubric chấm điểm assignment.</w:t>
+        <w:t>Thêm export điểm và tiến độ.</w:t>
       </w:r>
     </w:p>
     <w:p>
@@ -14220,7 +14421,7 @@
         <w:ind w:left="432" w:hanging="216"/>
       </w:pPr>
       <w:r>
-        <w:t>Thêm import sinh viên bằng CSV.</w:t>
+        <w:t>Thêm search/filter tài nguyên và bài học.</w:t>
       </w:r>
     </w:p>
     <w:p>
@@ -14230,7 +14431,7 @@
         <w:ind w:left="432" w:hanging="216"/>
       </w:pPr>
       <w:r>
-        <w:t>Thêm export điểm và tiến độ.</w:t>
+        <w:t>Cải thiện UI mobile.</w:t>
       </w:r>
     </w:p>
     <w:p>
@@ -14240,27 +14441,12 @@
         <w:ind w:left="432" w:hanging="216"/>
       </w:pPr>
       <w:r>
-        <w:t>Thêm search/filter tài nguyên và bài học.</w:t>
-      </w:r>
-    </w:p>
-    <w:p>
-      <w:pPr>
-        <w:pStyle w:val="ListBullet"/>
-        <w:spacing w:after="60"/>
-        <w:ind w:left="432" w:hanging="216"/>
-      </w:pPr>
-      <w:r>
-        <w:t>Cải thiện UI mobile.</w:t>
-      </w:r>
-    </w:p>
-    <w:p>
-      <w:pPr>
-        <w:pStyle w:val="ListBullet"/>
-        <w:spacing w:after="60"/>
-        <w:ind w:left="432" w:hanging="216"/>
-      </w:pPr>
-      <w:r>
         <w:t>Thêm test tự động cho các luồng quan trọng.</w:t>
+      </w:r>
+    </w:p>
+    <w:p>
+      <w:r>
+        <w:t>Nâng cấp video call từ kiến trúc Mesh P2P lên SFU (mediasoup) để hỗ trợ lớp học đông hơn và giảm tải cho client.</w:t>
       </w:r>
     </w:p>
     <w:p>

</xml_diff>